<commit_message>
feat: remove annual_income field
</commit_message>
<xml_diff>
--- a/templates/template2.docx
+++ b/templates/template2.docx
@@ -1,6 +1,6 @@
 
 <file path=word/document.xml><?xml version="1.0" encoding="utf-8"?>
-<w:document xmlns:wpc="http://schemas.microsoft.com/office/word/2010/wordprocessingCanvas" xmlns:cx="http://schemas.microsoft.com/office/drawing/2014/chartex" xmlns:cx1="http://schemas.microsoft.com/office/drawing/2015/9/8/chartex" xmlns:cx2="http://schemas.microsoft.com/office/drawing/2015/10/21/chartex" xmlns:cx3="http://schemas.microsoft.com/office/drawing/2016/5/9/chartex" xmlns:cx4="http://schemas.microsoft.com/office/drawing/2016/5/10/chartex" xmlns:cx5="http://schemas.microsoft.com/office/drawing/2016/5/11/chartex" xmlns:cx6="http://schemas.microsoft.com/office/drawing/2016/5/12/chartex" xmlns:cx7="http://schemas.microsoft.com/office/drawing/2016/5/13/chartex" xmlns:cx8="http://schemas.microsoft.com/office/drawing/2016/5/14/chartex" xmlns:mc="http://schemas.openxmlformats.org/markup-compatibility/2006" xmlns:aink="http://schemas.microsoft.com/office/drawing/2016/ink" xmlns:am3d="http://schemas.microsoft.com/office/drawing/2017/model3d" xmlns:o="urn:schemas-microsoft-com:office:office" xmlns:r="http://schemas.openxmlformats.org/officeDocument/2006/relationships" xmlns:m="http://schemas.openxmlformats.org/officeDocument/2006/math" xmlns:v="urn:schemas-microsoft-com:vml" xmlns:wp14="http://schemas.microsoft.com/office/word/2010/wordprocessingDrawing" xmlns:wp="http://schemas.openxmlformats.org/drawingml/2006/wordprocessingDrawing" xmlns:w10="urn:schemas-microsoft-com:office:word" xmlns:w="http://schemas.openxmlformats.org/wordprocessingml/2006/main" xmlns:w14="http://schemas.microsoft.com/office/word/2010/wordml" xmlns:w15="http://schemas.microsoft.com/office/word/2012/wordml" xmlns:w16cex="http://schemas.microsoft.com/office/word/2018/wordml/cex" xmlns:w16cid="http://schemas.microsoft.com/office/word/2016/wordml/cid" xmlns:w16="http://schemas.microsoft.com/office/word/2018/wordml" xmlns:w16se="http://schemas.microsoft.com/office/word/2015/wordml/symex" xmlns:wpg="http://schemas.microsoft.com/office/word/2010/wordprocessingGroup" xmlns:wpi="http://schemas.microsoft.com/office/word/2010/wordprocessingInk" xmlns:wne="http://schemas.microsoft.com/office/word/2006/wordml" xmlns:wps="http://schemas.microsoft.com/office/word/2010/wordprocessingShape" mc:Ignorable="w14 w15 w16se w16cid w16 w16cex wp14">
+<w:document xmlns:wpc="http://schemas.microsoft.com/office/word/2010/wordprocessingCanvas" xmlns:cx="http://schemas.microsoft.com/office/drawing/2014/chartex" xmlns:cx1="http://schemas.microsoft.com/office/drawing/2015/9/8/chartex" xmlns:cx2="http://schemas.microsoft.com/office/drawing/2015/10/21/chartex" xmlns:cx3="http://schemas.microsoft.com/office/drawing/2016/5/9/chartex" xmlns:cx4="http://schemas.microsoft.com/office/drawing/2016/5/10/chartex" xmlns:cx5="http://schemas.microsoft.com/office/drawing/2016/5/11/chartex" xmlns:cx6="http://schemas.microsoft.com/office/drawing/2016/5/12/chartex" xmlns:cx7="http://schemas.microsoft.com/office/drawing/2016/5/13/chartex" xmlns:cx8="http://schemas.microsoft.com/office/drawing/2016/5/14/chartex" xmlns:mc="http://schemas.openxmlformats.org/markup-compatibility/2006" xmlns:aink="http://schemas.microsoft.com/office/drawing/2016/ink" xmlns:am3d="http://schemas.microsoft.com/office/drawing/2017/model3d" xmlns:o="urn:schemas-microsoft-com:office:office" xmlns:oel="http://schemas.microsoft.com/office/2019/extlst" xmlns:r="http://schemas.openxmlformats.org/officeDocument/2006/relationships" xmlns:m="http://schemas.openxmlformats.org/officeDocument/2006/math" xmlns:v="urn:schemas-microsoft-com:vml" xmlns:wp14="http://schemas.microsoft.com/office/word/2010/wordprocessingDrawing" xmlns:wp="http://schemas.openxmlformats.org/drawingml/2006/wordprocessingDrawing" xmlns:w10="urn:schemas-microsoft-com:office:word" xmlns:w="http://schemas.openxmlformats.org/wordprocessingml/2006/main" xmlns:w14="http://schemas.microsoft.com/office/word/2010/wordml" xmlns:w15="http://schemas.microsoft.com/office/word/2012/wordml" xmlns:w16cex="http://schemas.microsoft.com/office/word/2018/wordml/cex" xmlns:w16cid="http://schemas.microsoft.com/office/word/2016/wordml/cid" xmlns:w16="http://schemas.microsoft.com/office/word/2018/wordml" xmlns:w16du="http://schemas.microsoft.com/office/word/2023/wordml/word16du" xmlns:w16sdtdh="http://schemas.microsoft.com/office/word/2020/wordml/sdtdatahash" xmlns:w16sdtfl="http://schemas.microsoft.com/office/word/2024/wordml/sdtformatlock" xmlns:w16se="http://schemas.microsoft.com/office/word/2015/wordml/symex" xmlns:wpg="http://schemas.microsoft.com/office/word/2010/wordprocessingGroup" xmlns:wpi="http://schemas.microsoft.com/office/word/2010/wordprocessingInk" xmlns:wne="http://schemas.microsoft.com/office/word/2006/wordml" xmlns:wps="http://schemas.microsoft.com/office/word/2010/wordprocessingShape" mc:Ignorable="w14 w15 w16se w16cid w16 w16cex w16sdtdh w16sdtfl w16du wp14">
   <w:body>
     <w:p>
       <w:r>
@@ -81,7 +81,7 @@
           <w:b/>
           <w:bCs/>
         </w:rPr>
-        <w:t xml:space="preserve">Address: {address}</w:t>
+        <w:t>Address: {address}</w:t>
       </w:r>
     </w:p>
     <w:p>
@@ -159,13 +159,7 @@
         <w:rPr>
           <w:rFonts w:ascii="Arial" w:hAnsi="Arial" w:cs="Arial"/>
         </w:rPr>
-        <w:t xml:space="preserve">Dear {name}</w:t>
-      </w:r>
-      <w:r>
-        <w:rPr>
-          <w:rFonts w:ascii="Arial" w:hAnsi="Arial" w:cs="Arial"/>
-        </w:rPr>
-        <w:t xml:space="preserve">, </w:t>
+        <w:t xml:space="preserve">Dear {name}, </w:t>
       </w:r>
     </w:p>
     <w:p>
@@ -313,7 +307,55 @@
         <w:rPr>
           <w:rFonts w:ascii="Arial" w:hAnsi="Arial" w:cs="Arial"/>
         </w:rPr>
-        <w:t>You require income protection cover to provide monthly payments to meet your financial needs if you</w:t>
+        <w:t>You require income protection cover to provide monthly payments to meet your financial needs if you are out of work due to ill-health.</w:t>
+      </w:r>
+    </w:p>
+    <w:p>
+      <w:pPr>
+        <w:pStyle w:val="NoSpacing"/>
+        <w:rPr>
+          <w:rFonts w:ascii="Arial" w:hAnsi="Arial" w:cs="Arial"/>
+        </w:rPr>
+      </w:pPr>
+      <w:r>
+        <w:rPr>
+          <w:rFonts w:ascii="Arial" w:hAnsi="Arial" w:cs="Arial"/>
+        </w:rPr>
+        <w:t xml:space="preserve">You would like coverage to last until you reach </w:t>
+      </w:r>
+      <w:r>
+        <w:rPr>
+          <w:rFonts w:ascii="Arial" w:hAnsi="Arial" w:cs="Arial"/>
+          <w:b/>
+          <w:bCs/>
+        </w:rPr>
+        <w:t>65</w:t>
+      </w:r>
+      <w:r>
+        <w:rPr>
+          <w:rFonts w:ascii="Arial" w:hAnsi="Arial" w:cs="Arial"/>
+        </w:rPr>
+        <w:t xml:space="preserve"> or until you are able to return to work. </w:t>
+      </w:r>
+    </w:p>
+    <w:p>
+      <w:pPr>
+        <w:pStyle w:val="NoSpacing"/>
+        <w:rPr>
+          <w:rFonts w:ascii="Arial" w:hAnsi="Arial" w:cs="Arial"/>
+        </w:rPr>
+      </w:pPr>
+      <w:r>
+        <w:rPr>
+          <w:rFonts w:ascii="Arial" w:hAnsi="Arial" w:cs="Arial"/>
+        </w:rPr>
+        <w:t xml:space="preserve">You would like income protection </w:t>
+      </w:r>
+      <w:r>
+        <w:rPr>
+          <w:rFonts w:ascii="Arial" w:hAnsi="Arial" w:cs="Arial"/>
+        </w:rPr>
+        <w:t>to cover</w:t>
       </w:r>
       <w:r>
         <w:rPr>
@@ -325,85 +367,13 @@
         <w:rPr>
           <w:rFonts w:ascii="Arial" w:hAnsi="Arial" w:cs="Arial"/>
         </w:rPr>
-        <w:t>are out of work due to ill-health</w:t>
-      </w:r>
-      <w:r>
-        <w:rPr>
-          <w:rFonts w:ascii="Arial" w:hAnsi="Arial" w:cs="Arial"/>
-        </w:rPr>
-        <w:t>.</w:t>
-      </w:r>
-    </w:p>
-    <w:p>
-      <w:pPr>
-        <w:pStyle w:val="NoSpacing"/>
-        <w:rPr>
-          <w:rFonts w:ascii="Arial" w:hAnsi="Arial" w:cs="Arial"/>
-        </w:rPr>
-      </w:pPr>
-      <w:r>
-        <w:rPr>
-          <w:rFonts w:ascii="Arial" w:hAnsi="Arial" w:cs="Arial"/>
-        </w:rPr>
-        <w:t xml:space="preserve">You would like coverage to last until you reach </w:t>
-      </w:r>
-      <w:r>
-        <w:rPr>
-          <w:rFonts w:ascii="Arial" w:hAnsi="Arial" w:cs="Arial"/>
-          <w:b/>
-          <w:bCs/>
-        </w:rPr>
-        <w:t>65</w:t>
-      </w:r>
-      <w:r>
-        <w:rPr>
-          <w:rFonts w:ascii="Arial" w:hAnsi="Arial" w:cs="Arial"/>
-        </w:rPr>
-        <w:t xml:space="preserve"> or until you are able to return to work. </w:t>
-      </w:r>
-    </w:p>
-    <w:p>
-      <w:pPr>
-        <w:pStyle w:val="NoSpacing"/>
-        <w:rPr>
-          <w:rFonts w:ascii="Arial" w:hAnsi="Arial" w:cs="Arial"/>
-        </w:rPr>
-      </w:pPr>
-      <w:r>
-        <w:rPr>
-          <w:rFonts w:ascii="Arial" w:hAnsi="Arial" w:cs="Arial"/>
-        </w:rPr>
-        <w:t xml:space="preserve">You would like income protection </w:t>
-      </w:r>
-      <w:r>
-        <w:rPr>
-          <w:rFonts w:ascii="Arial" w:hAnsi="Arial" w:cs="Arial"/>
-        </w:rPr>
-        <w:t>to cover</w:t>
-      </w:r>
-      <w:r>
-        <w:rPr>
-          <w:rFonts w:ascii="Arial" w:hAnsi="Arial" w:cs="Arial"/>
-        </w:rPr>
-        <w:t xml:space="preserve"> </w:t>
-      </w:r>
-      <w:r>
-        <w:rPr>
-          <w:rFonts w:ascii="Arial" w:hAnsi="Arial" w:cs="Arial"/>
-        </w:rPr>
         <w:t>and</w:t>
       </w:r>
       <w:r>
         <w:rPr>
           <w:rFonts w:ascii="Arial" w:hAnsi="Arial" w:cs="Arial"/>
         </w:rPr>
-        <w:t xml:space="preserve"> maintain your current standard of living if you cannot work due</w:t>
-      </w:r>
-      <w:r>
-        <w:rPr>
-          <w:rFonts w:ascii="Arial" w:hAnsi="Arial" w:cs="Arial"/>
-        </w:rPr>
-        <w:t xml:space="preserve"> to illness or injury.</w:t>
+        <w:t xml:space="preserve"> maintain your current standard of living if you cannot work due to illness or injury.</w:t>
       </w:r>
     </w:p>
     <w:p>
@@ -441,7 +411,7 @@
           <w:b/>
           <w:bCs/>
         </w:rPr>
-        <w:t>{deferral_period}</w:t>
+        <w:t>26</w:t>
       </w:r>
       <w:r>
         <w:rPr>
@@ -455,41 +425,29 @@
         <w:rPr>
           <w:rFonts w:ascii="Arial" w:hAnsi="Arial" w:cs="Arial"/>
         </w:rPr>
-        <w:t xml:space="preserve"> which is the continuous amount of time</w:t>
-      </w:r>
-      <w:r>
-        <w:rPr>
-          <w:rFonts w:ascii="Arial" w:hAnsi="Arial" w:cs="Arial"/>
-        </w:rPr>
-        <w:t xml:space="preserve"> </w:t>
-      </w:r>
-      <w:r>
-        <w:rPr>
-          <w:rFonts w:ascii="Arial" w:hAnsi="Arial" w:cs="Arial"/>
-        </w:rPr>
-        <w:t>that you must be out of work before the benefit is paid.</w:t>
-      </w:r>
-    </w:p>
-    <w:p>
-      <w:pPr>
-        <w:pStyle w:val="NoSpacing"/>
-        <w:rPr>
-          <w:rFonts w:ascii="Arial" w:hAnsi="Arial" w:cs="Arial"/>
-        </w:rPr>
-      </w:pPr>
-    </w:p>
-    <w:p>
-      <w:pPr>
-        <w:pStyle w:val="NoSpacing"/>
-        <w:rPr>
-          <w:rFonts w:ascii="Arial" w:hAnsi="Arial" w:cs="Arial"/>
-        </w:rPr>
-      </w:pPr>
-      <w:r>
-        <w:rPr>
-          <w:rFonts w:ascii="Arial" w:hAnsi="Arial" w:cs="Arial"/>
-        </w:rPr>
-        <w:t>You require an annual income protection benefit of €{income_protection_benefit} to be paid until your retirement age</w:t>
+        <w:t xml:space="preserve"> which is the continuous amount of time that you must be out of work before the benefit is paid.</w:t>
+      </w:r>
+    </w:p>
+    <w:p>
+      <w:pPr>
+        <w:pStyle w:val="NoSpacing"/>
+        <w:rPr>
+          <w:rFonts w:ascii="Arial" w:hAnsi="Arial" w:cs="Arial"/>
+        </w:rPr>
+      </w:pPr>
+    </w:p>
+    <w:p>
+      <w:pPr>
+        <w:pStyle w:val="NoSpacing"/>
+        <w:rPr>
+          <w:rFonts w:ascii="Arial" w:hAnsi="Arial" w:cs="Arial"/>
+        </w:rPr>
+      </w:pPr>
+      <w:r>
+        <w:rPr>
+          <w:rFonts w:ascii="Arial" w:hAnsi="Arial" w:cs="Arial"/>
+        </w:rPr>
+        <w:t>You require an annual income protection benefit of € to be paid until your retirement age</w:t>
       </w:r>
     </w:p>
     <w:p>
@@ -534,13 +492,7 @@
         <w:rPr>
           <w:rFonts w:ascii="Arial" w:hAnsi="Arial" w:cs="Arial"/>
         </w:rPr>
-        <w:t>Your health is in good standing. Currently, you have no specified serious illness cover</w:t>
-      </w:r>
-      <w:r>
-        <w:rPr>
-          <w:rFonts w:ascii="Arial" w:hAnsi="Arial" w:cs="Arial"/>
-        </w:rPr>
-        <w:t xml:space="preserve"> and you are employed.</w:t>
+        <w:t>Your health is in good standing. Currently, you have no specified serious illness cover and you are employed.</w:t>
       </w:r>
     </w:p>
     <w:p>
@@ -601,7 +553,7 @@
           <w:b/>
           <w:bCs/>
         </w:rPr>
-        <w:t>{annual_income}</w:t>
+        <w:t>35,000</w:t>
       </w:r>
       <w:r>
         <w:rPr>
@@ -671,35 +623,15 @@
         <w:rPr>
           <w:rFonts w:ascii="Arial" w:hAnsi="Arial" w:cs="Arial"/>
         </w:rPr>
-        <w:t>In line with your personal circumstances, we recommend that you effect an income protection policy with</w:t>
-      </w:r>
-      <w:r>
-        <w:rPr>
-          <w:rFonts w:ascii="Arial" w:hAnsi="Arial" w:cs="Arial"/>
-        </w:rPr>
-        <w:t xml:space="preserve"> </w:t>
-      </w:r>
-      <w:r>
-        <w:rPr>
-          <w:rFonts w:ascii="Arial" w:hAnsi="Arial" w:cs="Arial"/>
-        </w:rPr>
-        <w:t xml:space="preserve">an annual permanent health insurance (PHI) benefit of </w:t>
-      </w:r>
-      <w:r>
-        <w:rPr>
-          <w:rFonts w:ascii="Arial" w:hAnsi="Arial" w:cs="Arial"/>
-          <w:b/>
-          <w:bCs/>
-        </w:rPr>
-        <w:t>€</w:t>
-      </w:r>
-      <w:r>
-        <w:rPr>
-          <w:rFonts w:ascii="Arial" w:hAnsi="Arial" w:cs="Arial"/>
-          <w:b/>
-          <w:bCs/>
-        </w:rPr>
-        <w:t>34,320</w:t>
+        <w:t xml:space="preserve">In line with your personal circumstances, we recommend that you effect an income protection policy with an annual permanent health insurance (PHI) benefit of </w:t>
+      </w:r>
+      <w:r>
+        <w:rPr>
+          <w:rFonts w:ascii="Arial" w:hAnsi="Arial" w:cs="Arial"/>
+          <w:b/>
+          <w:bCs/>
+        </w:rPr>
+        <w:t>€34,320</w:t>
       </w:r>
       <w:r>
         <w:rPr>
@@ -741,19 +673,7 @@
         <w:rPr>
           <w:rFonts w:ascii="Arial" w:hAnsi="Arial" w:cs="Arial"/>
         </w:rPr>
-        <w:t xml:space="preserve"> has lapsed, whereby you were unable to work due to injury or</w:t>
-      </w:r>
-      <w:r>
-        <w:rPr>
-          <w:rFonts w:ascii="Arial" w:hAnsi="Arial" w:cs="Arial"/>
-        </w:rPr>
-        <w:t xml:space="preserve"> </w:t>
-      </w:r>
-      <w:r>
-        <w:rPr>
-          <w:rFonts w:ascii="Arial" w:hAnsi="Arial" w:cs="Arial"/>
-        </w:rPr>
-        <w:t>illness, benefits will be become payable under the plan.</w:t>
+        <w:t xml:space="preserve"> has lapsed, whereby you were unable to work due to injury or illness, benefits will be become payable under the plan.</w:t>
       </w:r>
     </w:p>
     <w:p>
@@ -1082,8 +1002,6 @@
           <w:rFonts w:ascii="Arial" w:hAnsi="Arial" w:cs="Arial"/>
         </w:rPr>
       </w:pPr>
-      <w:bookmarkStart w:id="0" w:name="_GoBack"/>
-      <w:bookmarkEnd w:id="0"/>
       <w:r>
         <w:rPr>
           <w:rFonts w:ascii="Arial" w:hAnsi="Arial" w:cs="Arial"/>
@@ -1479,21 +1397,7 @@
             <w:rStyle w:val="Hyperlink"/>
             <w:rFonts w:ascii="Arial" w:hAnsi="Arial" w:cs="Arial"/>
           </w:rPr>
-          <w:t>www.quoteangelinsuran</w:t>
-        </w:r>
-        <w:r>
-          <w:rPr>
-            <w:rStyle w:val="Hyperlink"/>
-            <w:rFonts w:ascii="Arial" w:hAnsi="Arial" w:cs="Arial"/>
-          </w:rPr>
-          <w:t>c</w:t>
-        </w:r>
-        <w:r>
-          <w:rPr>
-            <w:rStyle w:val="Hyperlink"/>
-            <w:rFonts w:ascii="Arial" w:hAnsi="Arial" w:cs="Arial"/>
-          </w:rPr>
-          <w:t>es.ie</w:t>
+          <w:t>www.quoteangelinsurances.ie</w:t>
         </w:r>
       </w:hyperlink>
     </w:p>
@@ -1516,7 +1420,7 @@
 </file>
 
 <file path=word/styles.xml><?xml version="1.0" encoding="utf-8"?>
-<w:styles xmlns:mc="http://schemas.openxmlformats.org/markup-compatibility/2006" xmlns:r="http://schemas.openxmlformats.org/officeDocument/2006/relationships" xmlns:w="http://schemas.openxmlformats.org/wordprocessingml/2006/main" xmlns:w14="http://schemas.microsoft.com/office/word/2010/wordml" xmlns:w15="http://schemas.microsoft.com/office/word/2012/wordml" xmlns:w16cex="http://schemas.microsoft.com/office/word/2018/wordml/cex" xmlns:w16cid="http://schemas.microsoft.com/office/word/2016/wordml/cid" xmlns:w16="http://schemas.microsoft.com/office/word/2018/wordml" xmlns:w16se="http://schemas.microsoft.com/office/word/2015/wordml/symex" mc:Ignorable="w14 w15 w16se w16cid w16 w16cex">
+<w:styles xmlns:mc="http://schemas.openxmlformats.org/markup-compatibility/2006" xmlns:r="http://schemas.openxmlformats.org/officeDocument/2006/relationships" xmlns:w="http://schemas.openxmlformats.org/wordprocessingml/2006/main" xmlns:w14="http://schemas.microsoft.com/office/word/2010/wordml" xmlns:w15="http://schemas.microsoft.com/office/word/2012/wordml" xmlns:w16cex="http://schemas.microsoft.com/office/word/2018/wordml/cex" xmlns:w16cid="http://schemas.microsoft.com/office/word/2016/wordml/cid" xmlns:w16="http://schemas.microsoft.com/office/word/2018/wordml" xmlns:w16du="http://schemas.microsoft.com/office/word/2023/wordml/word16du" xmlns:w16sdtdh="http://schemas.microsoft.com/office/word/2020/wordml/sdtdatahash" xmlns:w16sdtfl="http://schemas.microsoft.com/office/word/2024/wordml/sdtformatlock" xmlns:w16se="http://schemas.microsoft.com/office/word/2015/wordml/symex" mc:Ignorable="w14 w15 w16se w16cid w16 w16cex w16sdtdh w16sdtfl w16du">
   <w:docDefaults>
     <w:rPrDefault>
       <w:rPr>
@@ -1917,6 +1821,7 @@
   <w:style w:type="character" w:default="1" w:styleId="DefaultParagraphFont">
     <w:name w:val="Default Paragraph Font"/>
     <w:uiPriority w:val="1"/>
+    <w:semiHidden/>
     <w:unhideWhenUsed/>
   </w:style>
   <w:style w:type="table" w:default="1" w:styleId="TableNormal">

</xml_diff>